<commit_message>
Deploying to gh-pages from @ Morrison-Lab/psw@d9ec40032e7aae9a65c5807f9b9101deb048d9cb 🚀
</commit_message>
<xml_diff>
--- a/references.docx
+++ b/references.docx
@@ -15,7 +15,7 @@
         <w:pStyle w:val="Date"/>
       </w:pPr>
       <w:r>
-        <w:t xml:space="preserve">Last modified: 2026-07-29 20:07:53 (UTC)</w:t>
+        <w:t xml:space="preserve">Last modified: 2026-08-10 03:56:09 (UTC)</w:t>
       </w:r>
     </w:p>
     <w:bookmarkStart w:id="10" w:name="references"/>
@@ -88,7 +88,7 @@
         <w:t xml:space="preserve"> </w:t>
       </w:r>
       <w:r>
-        <w:t xml:space="preserve">572a353</w:t>
+        <w:t xml:space="preserve">d9ec400</w:t>
       </w:r>
     </w:p>
     <w:p>
@@ -110,7 +110,7 @@
         <w:t xml:space="preserve"> </w:t>
       </w:r>
       <w:r>
-        <w:t xml:space="preserve">572a353239b90318be84f0e6e7544ebd58b39e8e</w:t>
+        <w:t xml:space="preserve">d9ec40032e7aae9a65c5807f9b9101deb048d9cb</w:t>
       </w:r>
     </w:p>
     <w:p>
@@ -132,7 +132,7 @@
         <w:t xml:space="preserve"> </w:t>
       </w:r>
       <w:r>
-        <w:t xml:space="preserve">2026-07-29 13:07:39 -0700</w:t>
+        <w:t xml:space="preserve">2026-08-09 20:56:00 -0700</w:t>
       </w:r>
     </w:p>
     <w:p>

</xml_diff>

<commit_message>
Deploying to gh-pages from @ Morrison-Lab/psw@633dcf81d68243c3b49ccdfc8859b01a22a1804b 🚀
</commit_message>
<xml_diff>
--- a/references.docx
+++ b/references.docx
@@ -15,7 +15,7 @@
         <w:pStyle w:val="Date"/>
       </w:pPr>
       <w:r>
-        <w:t xml:space="preserve">Last modified: 2026-08-10 05:31:03 (UTC)</w:t>
+        <w:t xml:space="preserve">Last modified: 2026-09-10 21:47:41 (UTC)</w:t>
       </w:r>
     </w:p>
     <w:bookmarkStart w:id="10" w:name="references"/>
@@ -88,7 +88,7 @@
         <w:t xml:space="preserve"> </w:t>
       </w:r>
       <w:r>
-        <w:t xml:space="preserve">6c76dbe</w:t>
+        <w:t xml:space="preserve">633dcf8</w:t>
       </w:r>
     </w:p>
     <w:p>
@@ -110,7 +110,7 @@
         <w:t xml:space="preserve"> </w:t>
       </w:r>
       <w:r>
-        <w:t xml:space="preserve">6c76dbed21f538572aa55da47ef06df633f5ce0c</w:t>
+        <w:t xml:space="preserve">633dcf81d68243c3b49ccdfc8859b01a22a1804b</w:t>
       </w:r>
     </w:p>
     <w:p>
@@ -132,7 +132,7 @@
         <w:t xml:space="preserve"> </w:t>
       </w:r>
       <w:r>
-        <w:t xml:space="preserve">2026-08-09 22:30:47 -0700</w:t>
+        <w:t xml:space="preserve">2026-09-10 14:47:31 -0700</w:t>
       </w:r>
     </w:p>
     <w:p>

</xml_diff>

<commit_message>
Deploying to gh-pages from @ Morrison-Lab/psw@d7e7f293c7f87c5babbcd864ab3b1f8b2dea9e28 🚀
</commit_message>
<xml_diff>
--- a/references.docx
+++ b/references.docx
@@ -15,7 +15,7 @@
         <w:pStyle w:val="Date"/>
       </w:pPr>
       <w:r>
-        <w:t xml:space="preserve">Last modified: 2026-09-10 21:47:41 (UTC)</w:t>
+        <w:t xml:space="preserve">Last modified: 2026-09-10 21:55:51 (UTC)</w:t>
       </w:r>
     </w:p>
     <w:bookmarkStart w:id="10" w:name="references"/>
@@ -88,7 +88,7 @@
         <w:t xml:space="preserve"> </w:t>
       </w:r>
       <w:r>
-        <w:t xml:space="preserve">633dcf8</w:t>
+        <w:t xml:space="preserve">d7e7f29</w:t>
       </w:r>
     </w:p>
     <w:p>
@@ -110,7 +110,7 @@
         <w:t xml:space="preserve"> </w:t>
       </w:r>
       <w:r>
-        <w:t xml:space="preserve">633dcf81d68243c3b49ccdfc8859b01a22a1804b</w:t>
+        <w:t xml:space="preserve">d7e7f293c7f87c5babbcd864ab3b1f8b2dea9e28</w:t>
       </w:r>
     </w:p>
     <w:p>
@@ -132,7 +132,7 @@
         <w:t xml:space="preserve"> </w:t>
       </w:r>
       <w:r>
-        <w:t xml:space="preserve">2026-09-10 14:47:31 -0700</w:t>
+        <w:t xml:space="preserve">2026-09-10 14:55:42 -0700</w:t>
       </w:r>
     </w:p>
     <w:p>

</xml_diff>